<commit_message>
fix: address P11 escrow normative findings in two PDFs
</commit_message>
<xml_diff>
--- a/tools/candidates/portfolio-owner-pdf-20261013/13-raschet-metrami/51-algoritm-raschet-metrami.docx
+++ b/tools/candidates/portfolio-owner-pdf-20261013/13-raschet-metrami/51-algoritm-raschet-metrami.docx
@@ -154,7 +154,7 @@
         <w:keepLines/>
       </w:pPr>
       <w:r>
-        <w:t>Ключевой шаг. При эскроу-модели сделка участия в долевом строительстве считается оплаченной, когда счёт эскроу открыт и пополнен на сумму, указанную в договоре (проверьте действующую редакцию 214-ФЗ — в этот файл нормы намеренно не переписаны).</w:t>
+        <w:t>Ключевой шаг. По ч. 3 ст. 15.4 Федерального закона № 214-ФЗ обязанность участника долевого строительства по оплате цены ДДУ считается исполненной с момента поступления денежных средств на счёт эскроу. Проверьте сумму поступлений по документу банка и условия ДДУ; открытие счёта без поступления денег само по себе не подтверждает оплату.</w:t>
       </w:r>
     </w:p>
     <w:p>
@@ -197,7 +197,7 @@
         <w:keepLines/>
       </w:pPr>
       <w:r>
-        <w:t>Дальше — только если долг по эскроу гасится зачётом стоимости работ, оформленным письменно, и это подтвердил юрист — с учётом того, что банк и Росреестр могут не признать зачёт оплатой: практика по таким зачётам спорная. Обещание «после ввода выдадим акт, что расчёт произведён полностью» юридической силы против банка и реестра не имеет.</w:t>
+        <w:t>Зачёт встречных требований между сторонами сам по себе не подтверждает поступление денежных средств на счёт эскроу (ч. 3 ст. 15.4 Закона № 214-ФЗ). Если предлагается зачёт стоимости работ, отдельно проверьте основание, стороны и оформление зачёта, исполнение обязанности по оплате ДДУ и возможность уступки по ст. 11 Закона № 214-ФЗ. Акт о расчёте между сторонами не заменяет подтверждение банка о поступлении средств на эскроу.</w:t>
       </w:r>
     </w:p>
     <w:p>
@@ -284,7 +284,7 @@
         <w:keepLines/>
       </w:pPr>
       <w:r>
-        <w:t>Банки останавливают проектное финансирование при невыполнении ковенантов</w:t>
+        <w:t>Условия проектного финансирования определяются кредитной документацией конкретного проекта. Финансирование может быть ограничено при нарушении предусмотренных ею условий (ковенантов); наличие, содержание и последствия таких условий нельзя устанавливать только по темпам продаж.</w:t>
       </w:r>
     </w:p>
     <w:p>
@@ -293,7 +293,7 @@
         <w:ind w:left="283" w:hanging="142"/>
       </w:pPr>
       <w:r>
-        <w:t>— темпов строительства и, прежде всего, темпов продаж. Остановка означает: у застройщика нет источника платить деньгами, а квартиры, которыми он «рассчитывается», обеспечивают его долг перед банком.</w:t>
+        <w:t>Проверьте по документам проекта, есть ли ограничения финансирования и какое имущество или права переданы в обеспечение банку. Предложение расчёта квартирами само по себе не доказывает остановку финансирования или отсутствие у застройщика денежных средств.</w:t>
       </w:r>
     </w:p>
     <w:p>
@@ -320,7 +320,7 @@
         <w:ind w:left="283" w:hanging="142"/>
       </w:pPr>
       <w:r>
-        <w:t>— Косвенные признаки остановки: стройка замедлилась, подрядчики уходят, предложение метров вместо денег само по себе.</w:t>
+        <w:t>— Сопоставьте признаки риска: замедление строительства, изменения сроков, динамику продаж и предложение метров вместо денег. Это основания для дополнительной проверки, а не доказательства прекращения финансирования.</w:t>
       </w:r>
     </w:p>
     <w:p>
@@ -328,7 +328,7 @@
         <w:keepLines/>
       </w:pPr>
       <w:r>
-        <w:t>Развилка: признаки остановленного финансирования → предложение метров читать как способ достроить дом за счёт подрядчика.</w:t>
+        <w:t>Развилка: при признаках финансовых ограничений запросите подтверждение условий финансирования и обеспечения; оцените, не переносит ли предложенная схема риск недостатка денежных средств на подрядчика.</w:t>
       </w:r>
     </w:p>
     <w:p>
@@ -424,7 +424,7 @@
         <w:ind w:left="283" w:hanging="142"/>
       </w:pPr>
       <w:r>
-        <w:t>— Право требования передаётся оплаченным: эскроу пополнен до начала работ либо зачёт оформлен одновременно с уступкой, а не «после ввода».</w:t>
+        <w:t>— Передаваемое право проверено на оплату: поступление средств на эскроу подтверждено банком. Если цена ДДУ не оплачена, отдельно проверены условия уступки с одновременным переводом долга по ст. 11 Закона № 214-ФЗ и необходимое согласие кредитора (п. 2 ст. 391 ГК РФ). Зачёт между сторонами не подменяет оплату счёта эскроу.</w:t>
       </w:r>
     </w:p>
     <w:p>
@@ -433,7 +433,7 @@
         <w:ind w:left="283" w:hanging="142"/>
       </w:pPr>
       <w:r>
-        <w:t>— В уступке нет перехода обязанности пополнить эскроу — или переход прямо погашен зачётом в том же документе.</w:t>
+        <w:t>— В уступке точно определено, какие обязанности по оплате цены ДДУ переходят новому участнику; подтверждены фактическая оплата и согласия, необходимые для выбранной конструкции.</w:t>
       </w:r>
     </w:p>
     <w:p>
@@ -476,7 +476,7 @@
         <w:keepLines/>
       </w:pPr>
       <w:r>
-        <w:t>Нормативные ссылки сверяйте с действующими редакциями на дату сделки. Условия договора и документы проверяйте применительно к конкретной ситуации.</w:t>
+        <w:t>Перед подписанием сверяйте применимую редакцию Закона № 214-ФЗ, условия ДДУ, уступки и документы банка на дату сделки.</w:t>
       </w:r>
     </w:p>
     <w:p>
@@ -492,7 +492,7 @@
         <w:keepLines/>
       </w:pPr>
       <w:r>
-        <w:t>Значения нормативных требований сверяйте с действующей редакцией на дату сделки. Сделку с уступкой при пустом или не пополненном счёте эскроу без юриста не подписывать.</w:t>
+        <w:t>При отсутствии подтверждения оплаты эскроу решение о сделке принимайте только после проверки обязательств, порядка уступки и рисков по конкретным документам.</w:t>
       </w:r>
     </w:p>
     <w:sectPr>

</xml_diff>

<commit_message>
fix: P11 assignment payment timing
</commit_message>
<xml_diff>
--- a/tools/candidates/portfolio-owner-pdf-20261013/13-raschet-metrami/51-algoritm-raschet-metrami.docx
+++ b/tools/candidates/portfolio-owner-pdf-20261013/13-raschet-metrami/51-algoritm-raschet-metrami.docx
@@ -121,7 +121,7 @@
         <w:ind w:left="283" w:hanging="142"/>
       </w:pPr>
       <w:r>
-        <w:t>— зачёт встречных требований после регистрации ДДУ. Результат шага: названная форма. «Потом оформим» формой не является — работы без оформленной формы расчёта это работы в долг без документов о долге.</w:t>
+        <w:t>— зачёт стоимости работ в счёт цены уступки: отдельно проверьте основание и момент зачёта; если цедент — юридическое лицо, учтите требование об оплате цены уступки после госрегистрации соглашения (ч. 3 ст. 11 Закона № 214-ФЗ). Результат шага: названная форма расчёта. Обещание «потом оформим» не подтверждает оплату.</w:t>
       </w:r>
     </w:p>
     <w:p>
@@ -433,7 +433,7 @@
         <w:ind w:left="283" w:hanging="142"/>
       </w:pPr>
       <w:r>
-        <w:t>— В уступке точно определено, какие обязанности по оплате цены ДДУ переходят новому участнику; подтверждены фактическая оплата и согласия, необходимые для выбранной конструкции.</w:t>
+        <w:t>— Разделены три обязательства: цена ДДУ на эскроу, цена уступки цеденту и расчёты за работы. Если цедент — юридическое лицо, цена уступки уплачивается после государственной регистрации соглашения (ч. 3 ст. 11 Закона № 214-ФЗ). Для зачёта стоимости работ проверьте момент прекращения обязательства, встречные требования и применимость этого правила к конкретной конструкции до подписания.</w:t>
       </w:r>
     </w:p>
     <w:p>
@@ -477,22 +477,6 @@
       </w:pPr>
       <w:r>
         <w:t>Перед подписанием сверяйте применимую редакцию Закона № 214-ФЗ, условия ДДУ, уступки и документы банка на дату сделки.</w:t>
-      </w:r>
-    </w:p>
-    <w:p>
-      <w:pPr>
-        <w:keepLines/>
-      </w:pPr>
-      <w:r>
-        <w:t>Граница проходит по стадии. Пока сделка обсуждается и бумаги не подписаны — комплект работает. Уступка уже подписана и идёт спор — дальше работа юриста по конкретным документам. Застройщик в процедуре банкротства — это комплект «Реестр требований кредиторов» и юрист, а не эти файлы.</w:t>
-      </w:r>
-    </w:p>
-    <w:p>
-      <w:pPr>
-        <w:keepLines/>
-      </w:pPr>
-      <w:r>
-        <w:t>При отсутствии подтверждения оплаты эскроу решение о сделке принимайте только после проверки обязательств, порядка уступки и рисков по конкретным документам.</w:t>
       </w:r>
     </w:p>
     <w:sectPr>

</xml_diff>

<commit_message>
fix: P11 transfer boundary and unified stop rule
</commit_message>
<xml_diff>
--- a/tools/candidates/portfolio-owner-pdf-20261013/13-raschet-metrami/51-algoritm-raschet-metrami.docx
+++ b/tools/candidates/portfolio-owner-pdf-20261013/13-raschet-metrami/51-algoritm-raschet-metrami.docx
@@ -68,7 +68,7 @@
         <w:keepLines/>
       </w:pPr>
       <w:r>
-        <w:t>При отметке «→ юрист» получите правовую оценку до подписания документов. Алгоритм не запрещает расчёт метрами: он делает видимым, что именно предлагают, и переводит решение из «по старой памяти» в решение по проверенным фактам.</w:t>
+        <w:t>Правило комплекта: каждый красный флаг — правовая оценка. Два и более — СТОП: до проверки не подписывайте сделку и не начинайте работы в счёт недвижимости. Возобновление — после документальной проверки рисков, согласования мер защиты, включая обеспечение, и письменного решения руководителя. Правовые препятствия должны быть устранены.</w:t>
       </w:r>
     </w:p>
     <w:p>
@@ -137,7 +137,7 @@
         <w:keepLines/>
       </w:pPr>
       <w:r>
-        <w:t>До регистрации права требования у подрядчика нет ничего.</w:t>
+        <w:t>Уступка права на получение объекта допускается с момента государственной регистрации ДДУ до подписания сторонами передаточного акта или иного документа о передаче объекта (ч. 2 ст. 11 Закона № 214-ФЗ). Передача уже оформлена либо стадия не подтверждена — СТОП до определения применимой формы сделки. Ввод дома сам по себе не означает передачу объекта.</w:t>
       </w:r>
     </w:p>
     <w:p>
@@ -267,7 +267,7 @@
         <w:keepLines/>
       </w:pPr>
       <w:r>
-        <w:t>Развилка: срок ввода уже переносился, разрешение на исходе или истекло, дом не принят надзором (ЗОС не выдано) → каждый пункт — самостоятельный красный флаг. Два и больше → входить только с юристом и обеспечением (шаг 6).</w:t>
+        <w:t>Развилка: перенос ввода, истекающее или истёкшее разрешение, неснятые замечания надзора — поводы проверить риски. При двух и более флагах действует СТОП по правилу раздела «Граница применения». Проверка с юристом и наличие обеспечения сами по себе не разрешают подписать сделку.</w:t>
       </w:r>
     </w:p>
     <w:p>

</xml_diff>

<commit_message>
fix: address P11 buyer economics PDF placeholders and brand residual
</commit_message>
<xml_diff>
--- a/tools/candidates/portfolio-owner-pdf-20261013/13-raschet-metrami/51-algoritm-raschet-metrami.docx
+++ b/tools/candidates/portfolio-owner-pdf-20261013/13-raschet-metrami/51-algoritm-raschet-metrami.docx
@@ -415,7 +415,7 @@
         <w:ind w:left="283" w:hanging="142"/>
       </w:pPr>
       <w:r>
-        <w:t>— Денежная часть расчёта: {{ДОЛЯ_ДЕНЬГАМИ}} — метрами не более согласованной доли.</w:t>
+        <w:t>— Денежную часть расчёта и долю оплаты метрами зафиксируйте в редактируемом чек-листе 52. Передача прав должна соответствовать согласованным объёмам работ и условиям договора.</w:t>
       </w:r>
     </w:p>
     <w:p>
@@ -924,7 +924,8 @@
       <w:rFonts w:asciiTheme="majorHAnsi" w:eastAsiaTheme="majorEastAsia" w:hAnsiTheme="majorHAnsi" w:cstheme="majorBidi"/>
       <w:b/>
       <w:bCs/>
-      <w:color w:val="365F91" w:themeColor="accent1" w:themeShade="BF"/>
+      <w:i w:val="0"/>
+      <w:color w:val="303438"/>
       <w:sz w:val="28"/>
       <w:szCs w:val="28"/>
     </w:rPr>
@@ -949,7 +950,7 @@
       <w:b/>
       <w:bCs/>
       <w:i w:val="0"/>
-      <w:color w:val="7D6844"/>
+      <w:color w:val="303438"/>
       <w:sz w:val="24"/>
       <w:szCs w:val="26"/>
     </w:rPr>
@@ -1205,7 +1206,7 @@
     <w:rsid w:val="00FC693F"/>
     <w:pPr>
       <w:pBdr>
-        <w:bottom w:val="single" w:sz="8" w:space="4" w:color="4F81BD" w:themeColor="accent1"/>
+        <w:bottom w:val="single" w:sz="8" w:space="4" w:color="977A48"/>
       </w:pBdr>
       <w:spacing w:after="300" w:line="240" w:lineRule="auto"/>
       <w:contextualSpacing/>
@@ -1214,7 +1215,7 @@
       <w:rFonts w:asciiTheme="majorHAnsi" w:eastAsiaTheme="majorEastAsia" w:hAnsiTheme="majorHAnsi" w:cstheme="majorBidi" w:ascii="DejaVu Sans" w:hAnsi="DejaVu Sans"/>
       <w:b/>
       <w:i w:val="0"/>
-      <w:color w:val="282F37"/>
+      <w:color w:val="303438"/>
       <w:spacing w:val="5"/>
       <w:kern w:val="28"/>
       <w:sz w:val="34"/>
@@ -1253,7 +1254,7 @@
       <w:rFonts w:asciiTheme="majorHAnsi" w:eastAsiaTheme="majorEastAsia" w:hAnsiTheme="majorHAnsi" w:cstheme="majorBidi" w:ascii="DejaVu Sans" w:hAnsi="DejaVu Sans"/>
       <w:i w:val="0"/>
       <w:iCs/>
-      <w:color w:val="615B52"/>
+      <w:color w:val="303438"/>
       <w:spacing w:val="15"/>
       <w:sz w:val="20"/>
       <w:szCs w:val="24"/>

</xml_diff>